<commit_message>
ml analysis push 2
</commit_message>
<xml_diff>
--- a/backend/energy_audit_statistical_report.docx
+++ b/backend/energy_audit_statistical_report.docx
@@ -30,7 +30,7 @@
           <w:sz w:val="20"/>
         </w:rPr>
         <w:br/>
-        <w:t>Generated: 28 March 2026, 14:32</w:t>
+        <w:t>Generated: 29 March 2026, 13:05</w:t>
         <w:br/>
       </w:r>
       <w:r>
@@ -44,7 +44,7 @@
         <w:rPr>
           <w:sz w:val="20"/>
         </w:rPr>
-        <w:t>Synthetic dataset: 6000 samples · 105 injected anomalies</w:t>
+        <w:t>Synthetic dataset: 6000 samples · 44 injected anomalies</w:t>
         <w:br/>
       </w:r>
     </w:p>
@@ -196,7 +196,7 @@
     </w:p>
     <w:p>
       <w:r>
-        <w:t>This report presents the statistical evaluation of the two machine‑learning models deployed in the AI Smart Energy Audit System. A fresh synthetic dataset of 6,000 smart‑meter readings (with 105 intentionally injected anomalies) was generated exclusively for this analysis. The Isolation Forest model detects abnormal energy consumption patterns, while the Random Forest model predicts future power‑change deltas to enable proactive load management.</w:t>
+        <w:t>This report presents the statistical evaluation of the two machine‑learning models deployed in the AI Smart Energy Audit System. A fresh synthetic dataset of 6,000 smart‑meter readings (with 44 intentionally injected anomalies) was generated exclusively for this analysis. The Isolation Forest model detects abnormal energy consumption patterns, while the Random Forest model predicts future power‑change deltas to enable proactive load management.</w:t>
       </w:r>
     </w:p>
     <w:p>
@@ -212,7 +212,7 @@
         <w:pStyle w:val="ListBullet"/>
       </w:pPr>
       <w:r>
-        <w:t>Isolation Forest Accuracy: 95.92%</w:t>
+        <w:t>Isolation Forest Accuracy: 99.27%</w:t>
       </w:r>
     </w:p>
     <w:p>
@@ -220,7 +220,7 @@
         <w:pStyle w:val="ListBullet"/>
       </w:pPr>
       <w:r>
-        <w:t>Isolation Forest F1‑Score: 0.3951</w:t>
+        <w:t>Isolation Forest F1‑Score: 0.5769</w:t>
       </w:r>
     </w:p>
     <w:p>
@@ -228,7 +228,7 @@
         <w:pStyle w:val="ListBullet"/>
       </w:pPr>
       <w:r>
-        <w:t>Isolation Forest Recall (anomaly detection rate): 76.19%</w:t>
+        <w:t>Isolation Forest Recall (anomaly detection rate): 68.18%</w:t>
       </w:r>
     </w:p>
     <w:p>
@@ -236,7 +236,7 @@
         <w:pStyle w:val="ListBullet"/>
       </w:pPr>
       <w:r>
-        <w:t>Random Forest Test R²: 0.5546</w:t>
+        <w:t>Random Forest Test R²: 0.5996</w:t>
       </w:r>
     </w:p>
     <w:p>
@@ -244,7 +244,7 @@
         <w:pStyle w:val="ListBullet"/>
       </w:pPr>
       <w:r>
-        <w:t>Random Forest Test MAE: 19.5715 W</w:t>
+        <w:t>Random Forest Test MAE: 3.8259 W</w:t>
       </w:r>
     </w:p>
     <w:p>
@@ -252,7 +252,7 @@
         <w:pStyle w:val="ListBullet"/>
       </w:pPr>
       <w:r>
-        <w:t>Random Forest Test RMSE: 24.6421 W</w:t>
+        <w:t>Random Forest Test RMSE: 5.1176 W</w:t>
       </w:r>
     </w:p>
     <w:p>
@@ -493,7 +493,7 @@
               <w:rPr>
                 <w:sz w:val="18"/>
               </w:rPr>
-              <w:t>230.0429</w:t>
+              <w:t>233.0079</w:t>
             </w:r>
           </w:p>
         </w:tc>
@@ -509,7 +509,7 @@
               <w:rPr>
                 <w:sz w:val="18"/>
               </w:rPr>
-              <w:t>6.4524</w:t>
+              <w:t>3.7136</w:t>
             </w:r>
           </w:p>
         </w:tc>
@@ -525,7 +525,7 @@
               <w:rPr>
                 <w:sz w:val="18"/>
               </w:rPr>
-              <w:t>1489.0823</w:t>
+              <w:t>866.9426</w:t>
             </w:r>
           </w:p>
         </w:tc>
@@ -541,7 +541,7 @@
               <w:rPr>
                 <w:sz w:val="18"/>
               </w:rPr>
-              <w:t>1.2747</w:t>
+              <w:t>0.8354</w:t>
             </w:r>
           </w:p>
         </w:tc>
@@ -575,7 +575,7 @@
               <w:rPr>
                 <w:sz w:val="18"/>
               </w:rPr>
-              <w:t>14.8323</w:t>
+              <w:t>9.9661</w:t>
             </w:r>
           </w:p>
         </w:tc>
@@ -591,7 +591,7 @@
               <w:rPr>
                 <w:sz w:val="18"/>
               </w:rPr>
-              <w:t>4.0011</w:t>
+              <w:t>2.4580</w:t>
             </w:r>
           </w:p>
         </w:tc>
@@ -607,7 +607,7 @@
               <w:rPr>
                 <w:sz w:val="18"/>
               </w:rPr>
-              <w:t>928.8561</w:t>
+              <w:t>581.4964</w:t>
             </w:r>
           </w:p>
         </w:tc>
@@ -623,7 +623,7 @@
               <w:rPr>
                 <w:sz w:val="18"/>
               </w:rPr>
-              <w:t>0.6815</w:t>
+              <w:t>0.4058</w:t>
             </w:r>
           </w:p>
         </w:tc>
@@ -673,7 +673,7 @@
               <w:rPr>
                 <w:sz w:val="18"/>
               </w:rPr>
-              <w:t>-4.4029</w:t>
+              <w:t>-23.1878</w:t>
             </w:r>
           </w:p>
         </w:tc>
@@ -689,7 +689,7 @@
               <w:rPr>
                 <w:sz w:val="18"/>
               </w:rPr>
-              <w:t>-1009.9458</w:t>
+              <w:t>-5779.2386</w:t>
             </w:r>
           </w:p>
         </w:tc>
@@ -739,7 +739,7 @@
               <w:rPr>
                 <w:sz w:val="18"/>
               </w:rPr>
-              <w:t>227.0078</w:t>
+              <w:t>230.3299</w:t>
             </w:r>
           </w:p>
         </w:tc>
@@ -755,7 +755,7 @@
               <w:rPr>
                 <w:sz w:val="18"/>
               </w:rPr>
-              <w:t>3.1421</w:t>
+              <w:t>2.1376</w:t>
             </w:r>
           </w:p>
         </w:tc>
@@ -771,7 +771,7 @@
               <w:rPr>
                 <w:sz w:val="18"/>
               </w:rPr>
-              <w:t>727.2005</w:t>
+              <w:t>501.6358</w:t>
             </w:r>
           </w:p>
         </w:tc>
@@ -787,7 +787,7 @@
               <w:rPr>
                 <w:sz w:val="18"/>
               </w:rPr>
-              <w:t>0.6289</w:t>
+              <w:t>0.4786</w:t>
             </w:r>
           </w:p>
         </w:tc>
@@ -821,7 +821,7 @@
               <w:rPr>
                 <w:sz w:val="18"/>
               </w:rPr>
-              <w:t>231.5836</w:t>
+              <w:t>233.4579</w:t>
             </w:r>
           </w:p>
         </w:tc>
@@ -837,7 +837,7 @@
               <w:rPr>
                 <w:sz w:val="18"/>
               </w:rPr>
-              <w:t>6.0907</w:t>
+              <w:t>3.6593</w:t>
             </w:r>
           </w:p>
         </w:tc>
@@ -853,7 +853,7 @@
               <w:rPr>
                 <w:sz w:val="18"/>
               </w:rPr>
-              <w:t>1397.8702</w:t>
+              <w:t>852.1986</w:t>
             </w:r>
           </w:p>
         </w:tc>
@@ -869,7 +869,7 @@
               <w:rPr>
                 <w:sz w:val="18"/>
               </w:rPr>
-              <w:t>1.2830</w:t>
+              <w:t>0.8972</w:t>
             </w:r>
           </w:p>
         </w:tc>
@@ -903,7 +903,7 @@
               <w:rPr>
                 <w:sz w:val="18"/>
               </w:rPr>
-              <w:t>235.4056</w:t>
+              <w:t>237.2293</w:t>
             </w:r>
           </w:p>
         </w:tc>
@@ -919,7 +919,7 @@
               <w:rPr>
                 <w:sz w:val="18"/>
               </w:rPr>
-              <w:t>9.1640</w:t>
+              <w:t>5.0162</w:t>
             </w:r>
           </w:p>
         </w:tc>
@@ -935,7 +935,7 @@
               <w:rPr>
                 <w:sz w:val="18"/>
               </w:rPr>
-              <w:t>2108.9610</w:t>
+              <w:t>1170.6325</w:t>
             </w:r>
           </w:p>
         </w:tc>
@@ -951,7 +951,7 @@
               <w:rPr>
                 <w:sz w:val="18"/>
               </w:rPr>
-              <w:t>1.8815</w:t>
+              <w:t>1.2031</w:t>
             </w:r>
           </w:p>
         </w:tc>
@@ -985,7 +985,7 @@
               <w:rPr>
                 <w:sz w:val="18"/>
               </w:rPr>
-              <w:t>285.0309</w:t>
+              <w:t>283.9264</w:t>
             </w:r>
           </w:p>
         </w:tc>
@@ -1001,7 +1001,7 @@
               <w:rPr>
                 <w:sz w:val="18"/>
               </w:rPr>
-              <w:t>38.2513</w:t>
+              <w:t>48.3553</w:t>
             </w:r>
           </w:p>
         </w:tc>
@@ -1017,7 +1017,7 @@
               <w:rPr>
                 <w:sz w:val="18"/>
               </w:rPr>
-              <w:t>9109.1047</w:t>
+              <w:t>11553.0058</w:t>
             </w:r>
           </w:p>
         </w:tc>
@@ -1033,7 +1033,7 @@
               <w:rPr>
                 <w:sz w:val="18"/>
               </w:rPr>
-              <w:t>2.4639</w:t>
+              <w:t>1.4238</w:t>
             </w:r>
           </w:p>
         </w:tc>
@@ -1357,7 +1357,7 @@
               <w:rPr>
                 <w:sz w:val="18"/>
               </w:rPr>
-              <w:t>105</w:t>
+              <w:t>44</w:t>
             </w:r>
           </w:p>
         </w:tc>
@@ -1376,7 +1376,7 @@
       <w:r>
         <w:drawing>
           <wp:inline xmlns:a="http://schemas.openxmlformats.org/drawingml/2006/main" xmlns:pic="http://schemas.openxmlformats.org/drawingml/2006/picture">
-            <wp:extent cx="5669280" cy="3741471"/>
+            <wp:extent cx="5669280" cy="3753038"/>
             <wp:docPr id="1" name="Picture 1"/>
             <wp:cNvGraphicFramePr>
               <a:graphicFrameLocks noChangeAspect="1"/>
@@ -1397,7 +1397,7 @@
                   <pic:spPr>
                     <a:xfrm>
                       <a:off x="0" y="0"/>
-                      <a:ext cx="5669280" cy="3741471"/>
+                      <a:ext cx="5669280" cy="3753038"/>
                     </a:xfrm>
                     <a:prstGeom prst="rect"/>
                   </pic:spPr>
@@ -1539,7 +1539,7 @@
               <w:rPr>
                 <w:sz w:val="18"/>
               </w:rPr>
-              <w:t>100</w:t>
+              <w:t>200</w:t>
             </w:r>
           </w:p>
         </w:tc>
@@ -1573,7 +1573,7 @@
               <w:rPr>
                 <w:sz w:val="18"/>
               </w:rPr>
-              <w:t>0.05 (5%)</w:t>
+              <w:t>Auto (matched to true anomaly rate ≈ 0.7–2%)</w:t>
             </w:r>
           </w:p>
         </w:tc>
@@ -1607,7 +1607,7 @@
               <w:rPr>
                 <w:sz w:val="18"/>
               </w:rPr>
-              <w:t>Δ Voltage, Δ Current, Δ Power</w:t>
+              <w:t>ΔV, ΔI, ΔP, Hist_P_10, Hist_P_50</w:t>
             </w:r>
           </w:p>
         </w:tc>
@@ -1799,7 +1799,7 @@
               <w:rPr>
                 <w:sz w:val="18"/>
               </w:rPr>
-              <w:t>105</w:t>
+              <w:t>44</w:t>
             </w:r>
           </w:p>
         </w:tc>
@@ -1833,7 +1833,7 @@
               <w:rPr>
                 <w:sz w:val="18"/>
               </w:rPr>
-              <w:t>300</w:t>
+              <w:t>60</w:t>
             </w:r>
           </w:p>
         </w:tc>
@@ -1867,7 +1867,7 @@
               <w:rPr>
                 <w:sz w:val="18"/>
               </w:rPr>
-              <w:t>0.1061</w:t>
+              <w:t>0.1881</w:t>
             </w:r>
           </w:p>
         </w:tc>
@@ -1901,7 +1901,7 @@
               <w:rPr>
                 <w:sz w:val="18"/>
               </w:rPr>
-              <w:t>0.0585</w:t>
+              <w:t>0.0496</w:t>
             </w:r>
           </w:p>
         </w:tc>
@@ -1935,7 +1935,7 @@
               <w:rPr>
                 <w:sz w:val="18"/>
               </w:rPr>
-              <w:t>-0.3287</w:t>
+              <w:t>-0.1946</w:t>
             </w:r>
           </w:p>
         </w:tc>
@@ -1969,7 +1969,7 @@
               <w:rPr>
                 <w:sz w:val="18"/>
               </w:rPr>
-              <w:t>0.1603</w:t>
+              <w:t>0.2387</w:t>
             </w:r>
           </w:p>
         </w:tc>
@@ -2059,7 +2059,7 @@
               <w:rPr>
                 <w:sz w:val="18"/>
               </w:rPr>
-              <w:t>95.92%</w:t>
+              <w:t>99.27%</w:t>
             </w:r>
           </w:p>
         </w:tc>
@@ -2093,7 +2093,7 @@
               <w:rPr>
                 <w:sz w:val="18"/>
               </w:rPr>
-              <w:t>0.2667</w:t>
+              <w:t>0.5000</w:t>
             </w:r>
           </w:p>
         </w:tc>
@@ -2127,7 +2127,7 @@
               <w:rPr>
                 <w:sz w:val="18"/>
               </w:rPr>
-              <w:t>0.7619</w:t>
+              <w:t>0.6818</w:t>
             </w:r>
           </w:p>
         </w:tc>
@@ -2161,7 +2161,7 @@
               <w:rPr>
                 <w:sz w:val="18"/>
               </w:rPr>
-              <w:t>0.3951</w:t>
+              <w:t>0.5769</w:t>
             </w:r>
           </w:p>
         </w:tc>
@@ -2182,16 +2182,16 @@
         <w:t xml:space="preserve">              precision    recall  f1-score   support</w:t>
         <w:br/>
         <w:br/>
-        <w:t xml:space="preserve">      Normal       1.00      0.96      0.98      5895</w:t>
+        <w:t xml:space="preserve">      Normal       1.00      0.99      1.00      5956</w:t>
         <w:br/>
-        <w:t xml:space="preserve">     Anomaly       0.27      0.76      0.40       105</w:t>
+        <w:t xml:space="preserve">     Anomaly       0.50      0.68      0.58        44</w:t>
         <w:br/>
         <w:br/>
-        <w:t xml:space="preserve">    accuracy                           0.96      6000</w:t>
+        <w:t xml:space="preserve">    accuracy                           0.99      6000</w:t>
         <w:br/>
-        <w:t xml:space="preserve">   macro avg       0.63      0.86      0.69      6000</w:t>
+        <w:t xml:space="preserve">   macro avg       0.75      0.84      0.79      6000</w:t>
         <w:br/>
-        <w:t>weighted avg       0.98      0.96      0.97      6000</w:t>
+        <w:t>weighted avg       0.99      0.99      0.99      6000</w:t>
         <w:br/>
       </w:r>
     </w:p>
@@ -2498,7 +2498,7 @@
               <w:rPr>
                 <w:sz w:val="18"/>
               </w:rPr>
-              <w:t>Δ Voltage, Δ Current, Δ Power</w:t>
+              <w:t>ΔV, ΔI, ΔP, Hist_P_10, Hist_P_50</w:t>
             </w:r>
           </w:p>
         </w:tc>
@@ -2742,7 +2742,7 @@
               <w:rPr>
                 <w:sz w:val="18"/>
               </w:rPr>
-              <w:t>15.0610</w:t>
+              <w:t>3.1689</w:t>
             </w:r>
           </w:p>
         </w:tc>
@@ -2758,7 +2758,7 @@
               <w:rPr>
                 <w:sz w:val="18"/>
               </w:rPr>
-              <w:t>19.5715</w:t>
+              <w:t>3.8259</w:t>
             </w:r>
           </w:p>
         </w:tc>
@@ -2792,7 +2792,7 @@
               <w:rPr>
                 <w:sz w:val="18"/>
               </w:rPr>
-              <w:t>18.7594</w:t>
+              <w:t>4.0247</w:t>
             </w:r>
           </w:p>
         </w:tc>
@@ -2808,7 +2808,7 @@
               <w:rPr>
                 <w:sz w:val="18"/>
               </w:rPr>
-              <w:t>24.6421</w:t>
+              <w:t>5.1176</w:t>
             </w:r>
           </w:p>
         </w:tc>
@@ -2842,7 +2842,7 @@
               <w:rPr>
                 <w:sz w:val="18"/>
               </w:rPr>
-              <w:t>0.7478</w:t>
+              <w:t>0.7687</w:t>
             </w:r>
           </w:p>
         </w:tc>
@@ -2858,7 +2858,7 @@
               <w:rPr>
                 <w:sz w:val="18"/>
               </w:rPr>
-              <w:t>0.5546</w:t>
+              <w:t>0.5996</w:t>
             </w:r>
           </w:p>
         </w:tc>
@@ -2892,7 +2892,7 @@
               <w:rPr>
                 <w:sz w:val="18"/>
               </w:rPr>
-              <w:t>4,672</w:t>
+              <w:t>4,757</w:t>
             </w:r>
           </w:p>
         </w:tc>
@@ -2908,7 +2908,7 @@
               <w:rPr>
                 <w:sz w:val="18"/>
               </w:rPr>
-              <w:t>1,169</w:t>
+              <w:t>1,190</w:t>
             </w:r>
           </w:p>
         </w:tc>
@@ -2917,7 +2917,7 @@
     <w:p/>
     <w:p>
       <w:r>
-        <w:t>Residual mean: 0.4116 W | Residual std: 24.6387 W</w:t>
+        <w:t>Residual mean: -0.1276 W | Residual std: 5.1160 W</w:t>
       </w:r>
     </w:p>
     <w:p>
@@ -3004,7 +3004,7 @@
               <w:rPr>
                 <w:sz w:val="18"/>
               </w:rPr>
-              <w:t>0.0701</w:t>
+              <w:t>0.0489</w:t>
             </w:r>
           </w:p>
         </w:tc>
@@ -3038,7 +3038,7 @@
               <w:rPr>
                 <w:sz w:val="18"/>
               </w:rPr>
-              <w:t>0.2652</w:t>
+              <w:t>0.2362</w:t>
             </w:r>
           </w:p>
         </w:tc>
@@ -3072,7 +3072,75 @@
               <w:rPr>
                 <w:sz w:val="18"/>
               </w:rPr>
-              <w:t>0.6647</w:t>
+              <w:t>0.5737</w:t>
+            </w:r>
+          </w:p>
+        </w:tc>
+      </w:tr>
+      <w:tr>
+        <w:tc>
+          <w:tcPr>
+            <w:tcW w:type="dxa" w:w="4320"/>
+          </w:tcPr>
+          <w:p>
+            <w:pPr>
+              <w:jc w:val="center"/>
+            </w:pPr>
+            <w:r>
+              <w:rPr>
+                <w:sz w:val="18"/>
+              </w:rPr>
+              <w:t>hist_mean_p_10</w:t>
+            </w:r>
+          </w:p>
+        </w:tc>
+        <w:tc>
+          <w:tcPr>
+            <w:tcW w:type="dxa" w:w="4320"/>
+          </w:tcPr>
+          <w:p>
+            <w:pPr>
+              <w:jc w:val="center"/>
+            </w:pPr>
+            <w:r>
+              <w:rPr>
+                <w:sz w:val="18"/>
+              </w:rPr>
+              <w:t>0.0959</w:t>
+            </w:r>
+          </w:p>
+        </w:tc>
+      </w:tr>
+      <w:tr>
+        <w:tc>
+          <w:tcPr>
+            <w:tcW w:type="dxa" w:w="4320"/>
+          </w:tcPr>
+          <w:p>
+            <w:pPr>
+              <w:jc w:val="center"/>
+            </w:pPr>
+            <w:r>
+              <w:rPr>
+                <w:sz w:val="18"/>
+              </w:rPr>
+              <w:t>hist_mean_p_50</w:t>
+            </w:r>
+          </w:p>
+        </w:tc>
+        <w:tc>
+          <w:tcPr>
+            <w:tcW w:type="dxa" w:w="4320"/>
+          </w:tcPr>
+          <w:p>
+            <w:pPr>
+              <w:jc w:val="center"/>
+            </w:pPr>
+            <w:r>
+              <w:rPr>
+                <w:sz w:val="18"/>
+              </w:rPr>
+              <w:t>0.0453</w:t>
             </w:r>
           </w:p>
         </w:tc>
@@ -3085,7 +3153,7 @@
       <w:r>
         <w:drawing>
           <wp:inline xmlns:a="http://schemas.openxmlformats.org/drawingml/2006/main" xmlns:pic="http://schemas.openxmlformats.org/drawingml/2006/picture">
-            <wp:extent cx="4114800" cy="2364614"/>
+            <wp:extent cx="4114800" cy="2353962"/>
             <wp:docPr id="4" name="Picture 4"/>
             <wp:cNvGraphicFramePr>
               <a:graphicFrameLocks noChangeAspect="1"/>
@@ -3106,7 +3174,7 @@
                   <pic:spPr>
                     <a:xfrm>
                       <a:off x="0" y="0"/>
-                      <a:ext cx="4114800" cy="2364614"/>
+                      <a:ext cx="4114800" cy="2353962"/>
                     </a:xfrm>
                     <a:prstGeom prst="rect"/>
                   </pic:spPr>
@@ -3381,7 +3449,7 @@
               <w:rPr>
                 <w:sz w:val="18"/>
               </w:rPr>
-              <w:t>ΔV, ΔI, ΔP</w:t>
+              <w:t>ΔV, ΔI, ΔP, Hist_10, Hist_50</w:t>
             </w:r>
           </w:p>
         </w:tc>
@@ -3397,7 +3465,7 @@
               <w:rPr>
                 <w:sz w:val="18"/>
               </w:rPr>
-              <w:t>ΔV, ΔI, ΔP</w:t>
+              <w:t>ΔV, ΔI, ΔP, Hist_10, Hist_50</w:t>
             </w:r>
           </w:p>
         </w:tc>
@@ -3481,7 +3549,7 @@
               <w:rPr>
                 <w:sz w:val="18"/>
               </w:rPr>
-              <w:t>F1 = 0.3951</w:t>
+              <w:t>F1 = 0.5769</w:t>
             </w:r>
           </w:p>
         </w:tc>
@@ -3497,7 +3565,7 @@
               <w:rPr>
                 <w:sz w:val="18"/>
               </w:rPr>
-              <w:t>R² = 0.5546</w:t>
+              <w:t>R² = 0.5996</w:t>
             </w:r>
           </w:p>
         </w:tc>
@@ -3531,7 +3599,7 @@
               <w:rPr>
                 <w:sz w:val="18"/>
               </w:rPr>
-              <w:t>Recall = 0.7619</w:t>
+              <w:t>Recall = 0.6818</w:t>
             </w:r>
           </w:p>
         </w:tc>
@@ -3547,7 +3615,7 @@
               <w:rPr>
                 <w:sz w:val="18"/>
               </w:rPr>
-              <w:t>MAE = 19.5715 W</w:t>
+              <w:t>MAE = 3.8259 W</w:t>
             </w:r>
           </w:p>
         </w:tc>
@@ -3671,7 +3739,7 @@
         <w:pStyle w:val="ListBullet"/>
       </w:pPr>
       <w:r>
-        <w:t>The Isolation Forest model demonstrates strong anomaly detection capability with an accuracy of 95.92% and recall of 76.19%, indicating that the majority of genuine anomalies are successfully flagged.</w:t>
+        <w:t>The Isolation Forest model demonstrates strong anomaly detection capability with an accuracy of 99.27% and recall of 68.18%, indicating that the majority of genuine anomalies are successfully flagged.</w:t>
       </w:r>
     </w:p>
     <w:p>
@@ -3679,7 +3747,7 @@
         <w:pStyle w:val="ListBullet"/>
       </w:pPr>
       <w:r>
-        <w:t>The delta‑based feature engineering approach (ΔV, ΔI, ΔP) effectively normalises the input space, making the models adaptable to different baseline operating conditions without retraining.</w:t>
+        <w:t>The delta‑based feature engineering coupled with trailing historic averages (Hist_P_10, Hist_P_50) effectively normalises the input space while giving contextual continuity, making the models adaptable to different baseline operating conditions without retraining.</w:t>
       </w:r>
     </w:p>
     <w:p>
@@ -3687,7 +3755,7 @@
         <w:pStyle w:val="ListBullet"/>
       </w:pPr>
       <w:r>
-        <w:t>The Random Forest regressor achieves an R² of 0.5546 on the test set, with a mean absolute error of just 19.5715 W. This makes it suitable for real‑time next‑step power‑change forecasting on edge devices (ESP32 / Raspberry Pi).</w:t>
+        <w:t>The Random Forest regressor achieves an R² of 0.5996 on the test set, with a mean absolute error of just 3.8259 W. This makes it suitable for real‑time next‑step power‑change forecasting on edge devices (ESP32 / Raspberry Pi).</w:t>
       </w:r>
     </w:p>
     <w:p>
@@ -3703,7 +3771,7 @@
         <w:pStyle w:val="ListBullet"/>
       </w:pPr>
       <w:r>
-        <w:t>Future work includes incorporating temporal features (rolling windows), expanding the anomaly taxonomy, and evaluating LSTM/Transformer architectures for longer‑horizon power forecasting.</w:t>
+        <w:t>Future work includes deeply examining anomalous clusters during the duck curve transition, expanding the anomaly taxonomy, and evaluating LSTM/Transformer architectures for longer‑horizon power forecasting.</w:t>
       </w:r>
     </w:p>
     <w:p/>

</xml_diff>